<commit_message>
Updated 'issuefee' merge to work with new UI and added more use cases.
</commit_message>
<xml_diff>
--- a/project/documents/merged/Document1.docx
+++ b/project/documents/merged/Document1.docx
@@ -1424,6 +1424,7 @@
         <w:rPr>
           <w:noProof/>
         </w:rPr>
+        <w:t>77</w:t>
       </w:r>
       <w:r>
         <w:rPr>
@@ -2451,7 +2452,6 @@
           <w:sz w:val="24"/>
           <w:u w:val="single"/>
         </w:rPr>
-        <w:t>&lt;&lt;feeText</w:t>
       </w:r>
       <w:r>
         <w:rPr>
@@ -2459,22 +2459,98 @@
           <w:sz w:val="24"/>
           <w:u w:val="single"/>
         </w:rPr>
+      </w:r>
+      <w:r>
+        <w:rPr>
+          <w:noProof/>
+          <w:sz w:val="24"/>
+          <w:u w:val="single"/>
+        </w:rPr>
+      </w:r>
+      <w:r>
+        <w:rPr>
+          <w:noProof/>
+          <w:sz w:val="24"/>
+        </w:rPr>
+      </w:r>
+    </w:p>
+    <w:p>
+      <w:pPr>
+        <w:tabs>
+          <w:tab w:val="left" w:pos="720"/>
+        </w:tabs>
+        <w:ind w:left="720" w:hanging="720"/>
+        <w:rPr>
+          <w:noProof/>
+          <w:sz w:val="24"/>
+        </w:rPr>
+      </w:pPr>
+      <w:r>
+        <w:rPr>
+          <w:noProof/>
+          <w:sz w:val="24"/>
+          <w:u w:val="single"/>
+        </w:rPr>
+      </w:r>
+      <w:r>
+        <w:rPr>
+          <w:noProof/>
+          <w:sz w:val="24"/>
+          <w:u w:val="single"/>
+        </w:rPr>
+      </w:r>
+      <w:r>
+        <w:rPr>
+          <w:noProof/>
+          <w:sz w:val="24"/>
+        </w:rPr>
+      </w:r>
+    </w:p>
+    <w:p>
+      <w:pPr>
+        <w:tabs>
+          <w:tab w:val="left" w:pos="720"/>
+        </w:tabs>
+        <w:ind w:left="720" w:hanging="720"/>
+        <w:rPr>
+          <w:sz w:val="24"/>
+        </w:rPr>
+      </w:pPr>
+      <w:r>
+        <w:rPr>
+          <w:sz w:val="24"/>
+          <w:u w:val="single"/>
+        </w:rPr>
         <w:t>X</w:t>
       </w:r>
       <w:r>
         <w:rPr>
-          <w:noProof/>
+          <w:sz w:val="24"/>
+        </w:rPr>
+        <w:tab/>
+        <w:t>Issue Fee Transmittal (Form PTOL-85).</w:t>
+      </w:r>
+    </w:p>
+    <w:p>
+      <w:pPr>
+        <w:tabs>
+          <w:tab w:val="left" w:pos="720"/>
+        </w:tabs>
+        <w:ind w:left="720" w:hanging="720"/>
+        <w:rPr>
+          <w:sz w:val="24"/>
+        </w:rPr>
+      </w:pPr>
+      <w:r>
+        <w:rPr>
           <w:sz w:val="24"/>
           <w:u w:val="single"/>
         </w:rPr>
-        <w:t>&gt;&gt;</w:t>
-      </w:r>
-      <w:r>
-        <w:rPr>
-          <w:noProof/>
-          <w:sz w:val="24"/>
-        </w:rPr>
-        <w:t>&lt;&lt;FeeText&gt;&gt;</w:t>
+      </w:r>
+      <w:r>
+        <w:rPr>
+          <w:sz w:val="24"/>
+        </w:rPr>
       </w:r>
     </w:p>
     <w:p>
@@ -2494,22 +2570,44 @@
           <w:sz w:val="24"/>
           <w:u w:val="single"/>
         </w:rPr>
-        <w:t>&lt;&lt;pubFeeX&gt;</w:t>
-      </w:r>
-      <w:r>
-        <w:rPr>
-          <w:noProof/>
-          <w:sz w:val="24"/>
+        <w:t>X</w:t>
+      </w:r>
+      <w:r>
+        <w:rPr>
+          <w:noProof/>
+          <w:sz w:val="24"/>
+        </w:rPr>
+        <w:tab/>
+        <w:t>Communication Re: Fee Address (1 page).</w:t>
+      </w:r>
+    </w:p>
+    <w:p>
+      <w:pPr>
+        <w:tabs>
+          <w:tab w:val="left" w:pos="720"/>
+        </w:tabs>
+        <w:ind w:left="720" w:hanging="720"/>
+        <w:rPr>
+          <w:noProof/>
+          <w:sz w:val="24"/>
+        </w:rPr>
+      </w:pPr>
+      <w:r>
+        <w:rPr>
+          <w:noProof/>
+          <w:sz w:val="24"/>
+          <w:szCs w:val="22"/>
           <w:u w:val="single"/>
         </w:rPr>
-        <w:t>&gt;</w:t>
-      </w:r>
-      <w:r>
-        <w:rPr>
-          <w:noProof/>
-          <w:sz w:val="24"/>
-        </w:rPr>
-        <w:t>&lt;&lt;pubFeeText&gt;&gt;</w:t>
+        <w:t>X</w:t>
+      </w:r>
+      <w:r>
+        <w:rPr>
+          <w:noProof/>
+          <w:sz w:val="24"/>
+          <w:szCs w:val="22"/>
+        </w:rPr>
+        <w:t xml:space="preserve">         Application for Patent Term Adjustment Under 37 CFR 1.705(b) (1 pg.).</w:t>
       </w:r>
     </w:p>
     <w:p>
@@ -2519,11 +2617,13 @@
         </w:tabs>
         <w:ind w:left="720" w:hanging="720"/>
         <w:rPr>
-          <w:sz w:val="24"/>
-        </w:rPr>
-      </w:pPr>
-      <w:r>
-        <w:rPr>
+          <w:noProof/>
+          <w:sz w:val="24"/>
+        </w:rPr>
+      </w:pPr>
+      <w:r>
+        <w:rPr>
+          <w:noProof/>
           <w:sz w:val="24"/>
           <w:u w:val="single"/>
         </w:rPr>
@@ -2531,10 +2631,10 @@
       </w:r>
       <w:r>
         <w:rPr>
-          <w:sz w:val="24"/>
-        </w:rPr>
-        <w:tab/>
-        <w:t>Issue Fee Transmittal (Form PTOL-85).</w:t>
+          <w:noProof/>
+          <w:sz w:val="24"/>
+        </w:rPr>
+        <w:t xml:space="preserve">         Check in the amount of12to cover the fee for Application for Patent Term Adjustment under 37 CFR 1.18(e).</w:t>
       </w:r>
     </w:p>
     <w:p>
@@ -2544,21 +2644,24 @@
         </w:tabs>
         <w:ind w:left="720" w:hanging="720"/>
         <w:rPr>
-          <w:sz w:val="24"/>
-        </w:rPr>
-      </w:pPr>
-      <w:r>
-        <w:rPr>
+          <w:noProof/>
+          <w:sz w:val="24"/>
+        </w:rPr>
+      </w:pPr>
+      <w:r>
+        <w:rPr>
+          <w:noProof/>
           <w:sz w:val="24"/>
           <w:u w:val="single"/>
         </w:rPr>
-        <w:t>&lt;&lt;previousX&gt;&gt;</w:t>
-      </w:r>
-      <w:r>
-        <w:rPr>
-          <w:sz w:val="24"/>
-        </w:rPr>
-        <w:t>&lt;&lt;applyPreviousText&gt;&gt;</w:t>
+        <w:t>X</w:t>
+      </w:r>
+      <w:r>
+        <w:rPr>
+          <w:noProof/>
+          <w:sz w:val="24"/>
+        </w:rPr>
+        <w:t xml:space="preserve">         Statement of Facts Under 37 CFR 1.705(b)(2) in Support of Application for Patent Term Adjustment (4 pgs.).</w:t>
       </w:r>
     </w:p>
     <w:p>
@@ -2570,12 +2673,14 @@
         <w:rPr>
           <w:noProof/>
           <w:sz w:val="24"/>
-        </w:rPr>
-      </w:pPr>
-      <w:r>
-        <w:rPr>
-          <w:noProof/>
-          <w:sz w:val="24"/>
+          <w:szCs w:val="22"/>
+        </w:rPr>
+      </w:pPr>
+      <w:r>
+        <w:rPr>
+          <w:noProof/>
+          <w:sz w:val="24"/>
+          <w:szCs w:val="22"/>
           <w:u w:val="single"/>
         </w:rPr>
         <w:t>X</w:t>
@@ -2584,122 +2689,9 @@
         <w:rPr>
           <w:noProof/>
           <w:sz w:val="24"/>
-        </w:rPr>
-        <w:tab/>
-        <w:t>Communication Re: Fee Address (1 page).</w:t>
-      </w:r>
-    </w:p>
-    <w:p>
-      <w:pPr>
-        <w:tabs>
-          <w:tab w:val="left" w:pos="720"/>
-        </w:tabs>
-        <w:ind w:left="720" w:hanging="720"/>
-        <w:rPr>
-          <w:noProof/>
-          <w:sz w:val="24"/>
-        </w:rPr>
-      </w:pPr>
-      <w:r>
-        <w:rPr>
-          <w:noProof/>
-          <w:sz w:val="24"/>
-          <w:szCs w:val="22"/>
-          <w:u w:val="single"/>
-        </w:rPr>
-        <w:t>('X',)</w:t>
-      </w:r>
-      <w:r>
-        <w:rPr>
-          <w:noProof/>
-          <w:sz w:val="24"/>
-          <w:szCs w:val="22"/>
-        </w:rPr>
-        <w:t>Application for Patent Term Adjustment Under 37 CFR 1.705(b) (1 pg.).</w:t>
-      </w:r>
-    </w:p>
-    <w:p>
-      <w:pPr>
-        <w:tabs>
-          <w:tab w:val="left" w:pos="720"/>
-        </w:tabs>
-        <w:ind w:left="720" w:hanging="720"/>
-        <w:rPr>
-          <w:noProof/>
-          <w:sz w:val="24"/>
-        </w:rPr>
-      </w:pPr>
-      <w:r>
-        <w:rPr>
-          <w:noProof/>
-          <w:sz w:val="24"/>
-          <w:u w:val="single"/>
-        </w:rPr>
-        <w:t>('X',)</w:t>
-      </w:r>
-      <w:r>
-        <w:rPr>
-          <w:noProof/>
-          <w:sz w:val="24"/>
-        </w:rPr>
-        <w:t>Check in the amount of " + IIF(DATE()&gt;={10/02/20}, $210.00, $200.00Appe) + " to cover the fee for Application for Patent Term Adjustment under 37 CFR 1.18(e).</w:t>
-      </w:r>
-    </w:p>
-    <w:p>
-      <w:pPr>
-        <w:tabs>
-          <w:tab w:val="left" w:pos="720"/>
-        </w:tabs>
-        <w:ind w:left="720" w:hanging="720"/>
-        <w:rPr>
-          <w:noProof/>
-          <w:sz w:val="24"/>
-        </w:rPr>
-      </w:pPr>
-      <w:r>
-        <w:rPr>
-          <w:noProof/>
-          <w:sz w:val="24"/>
-          <w:u w:val="single"/>
-        </w:rPr>
-        <w:t>('X',)</w:t>
-      </w:r>
-      <w:r>
-        <w:rPr>
-          <w:noProof/>
-          <w:sz w:val="24"/>
-        </w:rPr>
-        <w:t>Statement of Facts Under 37 CFR 1.705(b)(2) in Support of Application for Patent Term Adjustment</w:t>
-      </w:r>
-    </w:p>
-    <w:p>
-      <w:pPr>
-        <w:tabs>
-          <w:tab w:val="left" w:pos="720"/>
-        </w:tabs>
-        <w:ind w:left="720" w:hanging="720"/>
-        <w:rPr>
-          <w:noProof/>
-          <w:sz w:val="24"/>
-          <w:szCs w:val="22"/>
-        </w:rPr>
-      </w:pPr>
-      <w:r>
-        <w:rPr>
-          <w:noProof/>
-          <w:sz w:val="24"/>
-          <w:szCs w:val="22"/>
-          <w:u w:val="single"/>
-        </w:rPr>
-        <w:t>&lt;&lt;drawingX&gt;&gt;</w:t>
-      </w:r>
-      <w:r>
-        <w:rPr>
-          <w:noProof/>
-          <w:sz w:val="24"/>
-          <w:szCs w:val="22"/>
-        </w:rPr>
-        <w:t>true</w:t>
+          <w:szCs w:val="22"/>
+        </w:rPr>
+        <w:t xml:space="preserve">         Formal Drawings (5 sheets).</w:t>
       </w:r>
     </w:p>
     <w:p>

</xml_diff>

<commit_message>
Worked on filling 'RptInvtPayFees' merge. Created 'PctCommRe' UI.
</commit_message>
<xml_diff>
--- a/project/documents/merged/Document1.docx
+++ b/project/documents/merged/Document1.docx
@@ -619,6 +619,7 @@
         <w:rPr>
           <w:rFonts w:ascii="Times New Roman" w:hAnsi="Times New Roman"/>
         </w:rPr>
+        <w:t>/ {{Sig_es_:signer1:signature}} /</w:t>
       </w:r>
     </w:p>
     <w:p>
@@ -1283,6 +1284,7 @@
         <w:rPr>
           <w:rFonts w:ascii="Times New Roman" w:hAnsi="Times New Roman"/>
         </w:rPr>
+        <w:t>123123</w:t>
       </w:r>
       <w:r>
         <w:rPr>
@@ -1347,7 +1349,7 @@
           <w:rFonts w:ascii="Times New Roman" w:hAnsi="Times New Roman"/>
           <w:noProof/>
         </w:rPr>
-        <w:t>which is believed to be in compliance with Annex A of the Invitation.</w:t>
+        <w:t>dfgdfgdfgwhich is believed to be in compliance with Annex A of the Invitation.</w:t>
       </w:r>
       <w:r>
         <w:rPr>
@@ -1388,6 +1390,7 @@
           <w:rFonts w:ascii="Times New Roman" w:hAnsi="Times New Roman"/>
           <w:noProof/>
         </w:rPr>
+        <w:t>Replacement description pages 23, replacement claims pages 23 and replacement claims pages 23 which are believed to be in compliance with Annex B1 of the Invitation.</w:t>
       </w:r>
       <w:r>
         <w:rPr>
@@ -1428,7 +1431,7 @@
           <w:rFonts w:ascii="Times New Roman" w:hAnsi="Times New Roman"/>
           <w:noProof/>
         </w:rPr>
-        <w:t>Formal drawing sheets () which are all believed to be in compliance with Annex C1 of the Invitation.</w:t>
+        <w:t>Formal drawing sheets (23) which are all believed to be in compliance with Annex C1 of the Invitation.</w:t>
       </w:r>
     </w:p>
     <w:p>
@@ -1578,6 +1581,7 @@
         <w:rPr>
           <w:rFonts w:ascii="Times New Roman" w:hAnsi="Times New Roman"/>
         </w:rPr>
+        <w:t>{{Dte_es_:signer1:date}}</w:t>
       </w:r>
       <w:r>
         <w:rPr>
@@ -1602,6 +1606,7 @@
         <w:rPr>
           <w:rFonts w:ascii="Times New Roman" w:hAnsi="Times New Roman"/>
         </w:rPr>
+        <w:t>/ {{Sig_es_:signer1:signature}} /</w:t>
       </w:r>
     </w:p>
     <w:p>

</xml_diff>

<commit_message>
Fixed JS function to get selected country. Added country specific information for 'PctCommRe' merge.
</commit_message>
<xml_diff>
--- a/project/documents/merged/Document1.docx
+++ b/project/documents/merged/Document1.docx
@@ -9,7 +9,7 @@
         <w:jc w:val="center"/>
       </w:pPr>
       <w:r>
-        <w:t>&lt;&lt;inthePatentOffice&gt;&gt;</w:t>
+        <w:t>In the European Patent Office</w:t>
       </w:r>
     </w:p>
     <w:p>
@@ -124,7 +124,19 @@
     <w:p/>
     <w:p>
       <w:r>
-        <w:t>&lt;&lt;pctAddress&gt;&gt;</w:t>
+        <w:t>European Patent Office</w:t>
+      </w:r>
+      <w:r>
+        <w:br/>
+        <w:t>27 Erhardtstrasse</w:t>
+      </w:r>
+      <w:r>
+        <w:br/>
+        <w:t>D-80298 Munich</w:t>
+      </w:r>
+      <w:r>
+        <w:br/>
+        <w:t>GERMANY</w:t>
       </w:r>
     </w:p>
     <w:p/>
@@ -189,7 +201,7 @@
           <w:b/>
           <w:u w:val="single"/>
         </w:rPr>
-        <w:t>via &lt;&lt;</w:t>
+        <w:t>&lt;&lt;</w:t>
       </w:r>
       <w:r>
         <w:rPr>
@@ -289,21 +301,21 @@
       <w:r>
         <w:rPr>
           <w:noProof/>
+        </w:rPr>
+        <w:t xml:space="preserve">       </w:t>
+      </w:r>
+    </w:p>
+    <w:p>
+      <w:pPr>
+        <w:tabs>
+          <w:tab w:val="left" w:pos="490"/>
+        </w:tabs>
+        <w:ind w:left="490" w:hanging="490"/>
+        <w:rPr>
+          <w:noProof/>
           <w:u w:val="single"/>
         </w:rPr>
-      </w:r>
-      <w:r>
-        <w:rPr>
-          <w:noProof/>
-          <w:u w:val="single"/>
-        </w:rPr>
-      </w:r>
-      <w:r>
-        <w:rPr>
-          <w:noProof/>
-          <w:u w:val="single"/>
-        </w:rPr>
-      </w:r>
+      </w:pPr>
       <w:r>
         <w:rPr>
           <w:noProof/>
@@ -314,95 +326,21 @@
         <w:rPr>
           <w:noProof/>
         </w:rPr>
-      </w:r>
-      <w:r/>
-      <w:r/>
-      <w:r/>
-    </w:p>
-    <w:p>
-      <w:pPr>
-        <w:tabs>
-          <w:tab w:val="left" w:pos="490"/>
-        </w:tabs>
+        <w:t>&lt;&lt;seqRFLine&gt;&gt;</w:t>
+      </w:r>
+    </w:p>
+    <w:p>
+      <w:pPr>
         <w:ind w:left="490" w:hanging="490"/>
         <w:rPr>
           <w:noProof/>
-          <w:u w:val="single"/>
-        </w:rPr>
-      </w:pPr>
-      <w:r>
-        <w:rPr>
-          <w:noProof/>
-          <w:u w:val="single"/>
-        </w:rPr>
-      </w:r>
-      <w:r>
-        <w:rPr>
-          <w:noProof/>
-          <w:u w:val="single"/>
-        </w:rPr>
-      </w:r>
-      <w:r>
-        <w:rPr>
-          <w:noProof/>
-          <w:u w:val="single"/>
-        </w:rPr>
-      </w:r>
-      <w:r>
-        <w:rPr>
-          <w:noProof/>
-        </w:rPr>
-        <w:t xml:space="preserve">       </w:t>
-      </w:r>
-      <w:r>
-        <w:rPr>
-          <w:noProof/>
-        </w:rPr>
-        <w:t>&lt;&lt;seqRFLine&gt;&gt;</w:t>
-      </w:r>
-    </w:p>
-    <w:p>
-      <w:pPr>
-        <w:ind w:left="490" w:hanging="490"/>
-        <w:rPr>
-          <w:noProof/>
-        </w:rPr>
-      </w:pPr>
-      <w:r>
-        <w:rPr>
-          <w:noProof/>
-          <w:u w:val="single"/>
-        </w:rPr>
-      </w:r>
-      <w:r>
-        <w:rPr>
-          <w:noProof/>
-          <w:u w:val="single"/>
-        </w:rPr>
-      </w:r>
-      <w:r>
-        <w:rPr>
-          <w:noProof/>
-          <w:u w:val="single"/>
-        </w:rPr>
-      </w:r>
-      <w:r>
-        <w:rPr>
-          <w:noProof/>
-        </w:rPr>
-        <w:t xml:space="preserve">       </w:t>
-      </w:r>
-      <w:r>
-        <w:rPr>
-          <w:noProof/>
-        </w:rPr>
-      </w:r>
-      <w:r/>
-      <w:r>
-        <w:rPr>
-          <w:noProof/>
-        </w:rPr>
-        <w:t xml:space="preserve"> </w:t>
+        </w:rPr>
+      </w:pPr>
+      <w:r>
+        <w:rPr>
+          <w:noProof/>
+        </w:rPr>
+        <w:t xml:space="preserve">        </w:t>
       </w:r>
     </w:p>
     <w:p>
@@ -440,20 +378,6 @@
         </w:rPr>
         <w:t>Please charge any additional required fees or credit overpayment to Deposit Account 19-0743.</w:t>
       </w:r>
-      <w:r>
-        <w:rPr>
-          <w:b/>
-          <w:bCs/>
-          <w:noProof/>
-        </w:rPr>
-      </w:r>
-      <w:r>
-        <w:rPr>
-          <w:b/>
-          <w:bCs/>
-          <w:noProof/>
-        </w:rPr>
-      </w:r>
     </w:p>
     <w:p>
       <w:pPr>
@@ -561,7 +485,7 @@
           <w:u w:val="single"/>
         </w:rPr>
         <w:pict w14:anchorId="61E7C5D1">
-          <v:line id="_x0000_s2070" style="position:absolute;z-index:251657728" from="303.9pt,9.65pt" to="501.9pt,9.65pt"/>
+          <v:line id="_x0000_s2070" style="position:absolute;z-index:1" from="303.9pt,9.65pt" to="501.9pt,9.65pt"/>
         </w:pict>
       </w:r>
       <w:r>
@@ -629,11 +553,6 @@
       <w:r>
         <w:t xml:space="preserve">     </w:t>
       </w:r>
-      <w:r>
-        <w:t>Bradley Scheer</w:t>
-      </w:r>
-      <w:r/>
-      <w:r/>
     </w:p>
     <w:p>
       <w:pPr>
@@ -931,7 +850,19 @@
         <w:widowControl/>
       </w:pPr>
       <w:r>
-        <w:t>&lt;&lt;pctAddress&gt;&gt;</w:t>
+        <w:t>European Patent Office</w:t>
+      </w:r>
+      <w:r>
+        <w:br/>
+        <w:t>27 Erhardtstrasse</w:t>
+      </w:r>
+      <w:r>
+        <w:br/>
+        <w:t>D-80298 Munich</w:t>
+      </w:r>
+      <w:r>
+        <w:br/>
+        <w:t>GERMANY</w:t>
       </w:r>
     </w:p>
     <w:p>
@@ -963,32 +894,7 @@
           <w:noProof/>
           <w:color w:val="000000"/>
         </w:rPr>
-        <w:t xml:space="preserve">In response to the Invitation to furnish a Nucleotide and/or Amino Acid Sequence Listing dated </w:t>
-      </w:r>
-      <w:r>
-        <w:rPr>
-          <w:noProof/>
-          <w:color w:val="000000"/>
-        </w:rPr>
-      </w:r>
-      <w:r>
-        <w:rPr>
-          <w:noProof/>
-          <w:color w:val="000000"/>
-        </w:rPr>
-      </w:r>
-      <w:r>
-        <w:rPr>
-          <w:noProof/>
-          <w:color w:val="000000"/>
-        </w:rPr>
-      </w:r>
-      <w:r>
-        <w:rPr>
-          <w:noProof/>
-          <w:color w:val="000000"/>
-        </w:rPr>
-        <w:t xml:space="preserve">, enclosed is the SEQUENCE LISTING IN COMPUTER READABLE FORM (ASCII DOS TEXT), which is in compliance with WIPO Standard ST.25.  The general information in the SEQUENCE LISTING includes the names of applicant and inventors, as well as providing the correct information with regard to the Prior Application Data and does not include matter which goes beyond the disclosure in the above-identified international application as filed.  </w:t>
+        <w:t xml:space="preserve">In response to the Invitation to furnish a Nucleotide and/or Amino Acid Sequence Listing dated , enclosed is the SEQUENCE LISTING IN COMPUTER READABLE FORM (ASCII DOS TEXT), which is in compliance with WIPO Standard ST.25.  The general information in the SEQUENCE LISTING includes the names of applicant and inventors, as well as providing the correct information with regard to the Prior Application Data and does not include matter which goes beyond the disclosure in the above-identified international application as filed.  </w:t>
       </w:r>
     </w:p>
     <w:p>
@@ -1145,7 +1051,6 @@
         </w:rPr>
         <w:t xml:space="preserve"> </w:t>
       </w:r>
-      <w:r/>
       <w:r>
         <w:tab/>
         <w:t xml:space="preserve">      </w:t>
@@ -1154,7 +1059,6 @@
         <w:tab/>
         <w:t xml:space="preserve">       </w:t>
       </w:r>
-      <w:r/>
     </w:p>
     <w:p>
       <w:pPr>
@@ -1240,11 +1144,6 @@
           <w:noProof/>
         </w:rPr>
       </w:pPr>
-      <w:r>
-        <w:t>Bradley Scheer</w:t>
-      </w:r>
-      <w:r/>
-      <w:r/>
     </w:p>
     <w:p>
       <w:pPr>
@@ -1787,6 +1686,50 @@
     <w:lsdException w:name="Subtitle" w:qFormat="1"/>
     <w:lsdException w:name="Strong" w:qFormat="1"/>
     <w:lsdException w:name="Emphasis" w:qFormat="1"/>
+    <w:lsdException w:name="Normal Table" w:semiHidden="1" w:unhideWhenUsed="1"/>
+    <w:lsdException w:name="Table Simple 1" w:semiHidden="1" w:unhideWhenUsed="1"/>
+    <w:lsdException w:name="Table Simple 2" w:semiHidden="1" w:unhideWhenUsed="1"/>
+    <w:lsdException w:name="Table Simple 3" w:semiHidden="1" w:unhideWhenUsed="1"/>
+    <w:lsdException w:name="Table Classic 1" w:semiHidden="1" w:unhideWhenUsed="1"/>
+    <w:lsdException w:name="Table Classic 2" w:semiHidden="1" w:unhideWhenUsed="1"/>
+    <w:lsdException w:name="Table Classic 3" w:semiHidden="1" w:unhideWhenUsed="1"/>
+    <w:lsdException w:name="Table Classic 4" w:semiHidden="1" w:unhideWhenUsed="1"/>
+    <w:lsdException w:name="Table Colorful 1" w:semiHidden="1" w:unhideWhenUsed="1"/>
+    <w:lsdException w:name="Table Colorful 2" w:semiHidden="1" w:unhideWhenUsed="1"/>
+    <w:lsdException w:name="Table Colorful 3" w:semiHidden="1" w:unhideWhenUsed="1"/>
+    <w:lsdException w:name="Table Columns 1" w:semiHidden="1" w:unhideWhenUsed="1"/>
+    <w:lsdException w:name="Table Columns 2" w:semiHidden="1" w:unhideWhenUsed="1"/>
+    <w:lsdException w:name="Table Columns 3" w:semiHidden="1" w:unhideWhenUsed="1"/>
+    <w:lsdException w:name="Table Columns 4" w:semiHidden="1" w:unhideWhenUsed="1"/>
+    <w:lsdException w:name="Table Columns 5" w:semiHidden="1" w:unhideWhenUsed="1"/>
+    <w:lsdException w:name="Table Grid 1" w:semiHidden="1" w:unhideWhenUsed="1"/>
+    <w:lsdException w:name="Table Grid 2" w:semiHidden="1" w:unhideWhenUsed="1"/>
+    <w:lsdException w:name="Table Grid 3" w:semiHidden="1" w:unhideWhenUsed="1"/>
+    <w:lsdException w:name="Table Grid 4" w:semiHidden="1" w:unhideWhenUsed="1"/>
+    <w:lsdException w:name="Table Grid 5" w:semiHidden="1" w:unhideWhenUsed="1"/>
+    <w:lsdException w:name="Table Grid 6" w:semiHidden="1" w:unhideWhenUsed="1"/>
+    <w:lsdException w:name="Table Grid 7" w:semiHidden="1" w:unhideWhenUsed="1"/>
+    <w:lsdException w:name="Table Grid 8" w:semiHidden="1" w:unhideWhenUsed="1"/>
+    <w:lsdException w:name="Table List 1" w:semiHidden="1" w:unhideWhenUsed="1"/>
+    <w:lsdException w:name="Table List 2" w:semiHidden="1" w:unhideWhenUsed="1"/>
+    <w:lsdException w:name="Table List 3" w:semiHidden="1" w:unhideWhenUsed="1"/>
+    <w:lsdException w:name="Table List 4" w:semiHidden="1" w:unhideWhenUsed="1"/>
+    <w:lsdException w:name="Table List 5" w:semiHidden="1" w:unhideWhenUsed="1"/>
+    <w:lsdException w:name="Table List 6" w:semiHidden="1" w:unhideWhenUsed="1"/>
+    <w:lsdException w:name="Table List 7" w:semiHidden="1" w:unhideWhenUsed="1"/>
+    <w:lsdException w:name="Table List 8" w:semiHidden="1" w:unhideWhenUsed="1"/>
+    <w:lsdException w:name="Table 3D effects 1" w:semiHidden="1" w:unhideWhenUsed="1"/>
+    <w:lsdException w:name="Table 3D effects 2" w:semiHidden="1" w:unhideWhenUsed="1"/>
+    <w:lsdException w:name="Table 3D effects 3" w:semiHidden="1" w:unhideWhenUsed="1"/>
+    <w:lsdException w:name="Table Contemporary" w:semiHidden="1" w:unhideWhenUsed="1"/>
+    <w:lsdException w:name="Table Elegant" w:semiHidden="1" w:unhideWhenUsed="1"/>
+    <w:lsdException w:name="Table Professional" w:semiHidden="1" w:unhideWhenUsed="1"/>
+    <w:lsdException w:name="Table Subtle 1" w:semiHidden="1" w:unhideWhenUsed="1"/>
+    <w:lsdException w:name="Table Subtle 2" w:semiHidden="1" w:unhideWhenUsed="1"/>
+    <w:lsdException w:name="Table Web 1" w:semiHidden="1" w:unhideWhenUsed="1"/>
+    <w:lsdException w:name="Table Web 2" w:semiHidden="1" w:unhideWhenUsed="1"/>
+    <w:lsdException w:name="Table Web 3" w:semiHidden="1" w:unhideWhenUsed="1"/>
+    <w:lsdException w:name="Table Theme" w:semiHidden="1" w:unhideWhenUsed="1"/>
     <w:lsdException w:name="Placeholder Text" w:semiHidden="1" w:uiPriority="99"/>
     <w:lsdException w:name="No Spacing" w:uiPriority="1" w:qFormat="1"/>
     <w:lsdException w:name="Light Shading" w:uiPriority="60"/>
@@ -2064,11 +2007,15 @@
   </w:style>
   <w:style w:type="character" w:default="1" w:styleId="DefaultParagraphFont">
     <w:name w:val="Default Paragraph Font"/>
+    <w:uiPriority w:val="1"/>
     <w:semiHidden/>
+    <w:unhideWhenUsed/>
   </w:style>
   <w:style w:type="table" w:default="1" w:styleId="TableNormal">
     <w:name w:val="Normal Table"/>
+    <w:uiPriority w:val="99"/>
     <w:semiHidden/>
+    <w:unhideWhenUsed/>
     <w:tblPr>
       <w:tblInd w:w="0" w:type="dxa"/>
       <w:tblCellMar>
@@ -2081,7 +2028,9 @@
   </w:style>
   <w:style w:type="numbering" w:default="1" w:styleId="NoList">
     <w:name w:val="No List"/>
+    <w:uiPriority w:val="99"/>
     <w:semiHidden/>
+    <w:unhideWhenUsed/>
   </w:style>
   <w:style w:type="character" w:styleId="FootnoteReference">
     <w:name w:val="footnote reference"/>

</xml_diff>

<commit_message>
Worked on more popup UIs and created and filled various merge functions.
</commit_message>
<xml_diff>
--- a/project/documents/merged/Document1.docx
+++ b/project/documents/merged/Document1.docx
@@ -443,14 +443,86 @@
           <w:noProof/>
           <w:u w:val="single"/>
         </w:rPr>
+      </w:r>
+      <w:r>
+        <w:rPr>
+          <w:noProof/>
+        </w:rPr>
+        <w:tab/>
+      </w:r>
+    </w:p>
+    <w:p>
+      <w:pPr>
+        <w:tabs>
+          <w:tab w:val="left" w:pos="490"/>
+        </w:tabs>
+        <w:ind w:left="490" w:hanging="490"/>
+        <w:rPr>
+          <w:noProof/>
+        </w:rPr>
+      </w:pPr>
+      <w:r>
+        <w:rPr>
+          <w:noProof/>
+          <w:u w:val="single"/>
+        </w:rPr>
+      </w:r>
+      <w:r>
+        <w:rPr>
+          <w:noProof/>
+          <w:u w:val="single"/>
+        </w:rPr>
+      </w:r>
+      <w:r>
+        <w:rPr>
+          <w:noProof/>
+          <w:u w:val="single"/>
+        </w:rPr>
+      </w:r>
+      <w:r>
+        <w:rPr>
+          <w:noProof/>
+        </w:rPr>
+        <w:tab/>
+      </w:r>
+    </w:p>
+    <w:p>
+      <w:pPr>
+        <w:tabs>
+          <w:tab w:val="left" w:pos="490"/>
+        </w:tabs>
+        <w:ind w:left="490" w:hanging="490"/>
+        <w:rPr>
+          <w:noProof/>
+        </w:rPr>
+      </w:pPr>
+      <w:r>
+        <w:rPr>
+          <w:noProof/>
+          <w:u w:val="single"/>
+        </w:rPr>
+        <w:t>&lt;&lt;idsFee</w:t>
+      </w:r>
+      <w:r>
+        <w:rPr>
+          <w:noProof/>
+          <w:u w:val="single"/>
+        </w:rPr>
         <w:t>X</w:t>
       </w:r>
       <w:r>
         <w:rPr>
           <w:noProof/>
-        </w:rPr>
-        <w:tab/>
-        <w:t>Communication Concerning Prior and Copending Applications (5 pgs.)</w:t>
+          <w:u w:val="single"/>
+        </w:rPr>
+        <w:t>&gt;&gt;</w:t>
+      </w:r>
+      <w:r>
+        <w:rPr>
+          <w:noProof/>
+        </w:rPr>
+        <w:tab/>
+        <w:t>&lt;&lt;idsFeeText&gt;&gt;</w:t>
       </w:r>
     </w:p>
     <w:p>
@@ -472,84 +544,8 @@
       <w:r>
         <w:rPr>
           <w:noProof/>
-          <w:u w:val="single"/>
-        </w:rPr>
-      </w:r>
-      <w:r>
-        <w:rPr>
-          <w:noProof/>
-          <w:u w:val="single"/>
-        </w:rPr>
-      </w:r>
-      <w:r>
-        <w:rPr>
-          <w:noProof/>
-        </w:rPr>
-        <w:tab/>
-      </w:r>
-    </w:p>
-    <w:p>
-      <w:pPr>
-        <w:tabs>
-          <w:tab w:val="left" w:pos="490"/>
-        </w:tabs>
-        <w:ind w:left="490" w:hanging="490"/>
-        <w:rPr>
-          <w:noProof/>
-        </w:rPr>
-      </w:pPr>
-      <w:r>
-        <w:rPr>
-          <w:noProof/>
-          <w:u w:val="single"/>
-        </w:rPr>
-        <w:t>&lt;&lt;idsFee</w:t>
-      </w:r>
-      <w:r>
-        <w:rPr>
-          <w:noProof/>
-          <w:u w:val="single"/>
-        </w:rPr>
-        <w:t>X</w:t>
-      </w:r>
-      <w:r>
-        <w:rPr>
-          <w:noProof/>
-          <w:u w:val="single"/>
-        </w:rPr>
-        <w:t>&gt;&gt;</w:t>
-      </w:r>
-      <w:r>
-        <w:rPr>
-          <w:noProof/>
-        </w:rPr>
-        <w:tab/>
-        <w:t>&lt;&lt;idsFeeText&gt;&gt;</w:t>
-      </w:r>
-    </w:p>
-    <w:p>
-      <w:pPr>
-        <w:tabs>
-          <w:tab w:val="left" w:pos="490"/>
-        </w:tabs>
-        <w:ind w:left="490" w:hanging="490"/>
-        <w:rPr>
-          <w:noProof/>
-        </w:rPr>
-      </w:pPr>
-      <w:r>
-        <w:rPr>
-          <w:noProof/>
-          <w:u w:val="single"/>
-        </w:rPr>
-        <w:t>&lt;&lt;drawX&gt;&gt;</w:t>
-      </w:r>
-      <w:r>
-        <w:rPr>
-          <w:noProof/>
-        </w:rPr>
-        <w:tab/>
-        <w:t>&lt;&lt;drawText&gt;&gt;</w:t>
+        </w:rPr>
+        <w:tab/>
       </w:r>
     </w:p>
     <w:p>

</xml_diff>

<commit_message>
Worked on mergebasic function.
</commit_message>
<xml_diff>
--- a/project/documents/merged/Document1.docx
+++ b/project/documents/merged/Document1.docx
@@ -412,7 +412,7 @@
           <w:rFonts w:ascii="Times New Roman" w:hAnsi="Times New Roman"/>
           <w:noProof/>
         </w:rPr>
-        <w:t>&lt;&lt;clientRefNo&gt;&gt;</w:t>
+        <w:t>Ref. No. Pa Da</w:t>
       </w:r>
     </w:p>
     <w:p>
@@ -431,7 +431,7 @@
           <w:sz w:val="23"/>
           <w:szCs w:val="23"/>
         </w:rPr>
-        <w:t>&lt;&lt;</w:t>
+        <w:t>United States of America</w:t>
       </w:r>
       <w:r>
         <w:rPr>
@@ -439,7 +439,6 @@
           <w:sz w:val="23"/>
           <w:szCs w:val="23"/>
         </w:rPr>
-        <w:t>matterCountryN</w:t>
       </w:r>
       <w:r>
         <w:rPr>
@@ -447,7 +446,6 @@
           <w:sz w:val="23"/>
           <w:szCs w:val="23"/>
         </w:rPr>
-        <w:t>ame&gt;&gt;</w:t>
       </w:r>
       <w:r>
         <w:rPr>

</xml_diff>